<commit_message>
Add SOC web console (src/webapp.py, Flask) + architecture diagram + flask dependency
</commit_message>
<xml_diff>
--- a/docs/SentinelAI_Report.docx
+++ b/docs/SentinelAI_Report.docx
@@ -105,7 +105,7 @@
     </w:p>
     <w:p>
       <w:r>
-        <w:t>SentinelAI is an end-to-end AI security assistant that detects attacks in network traffic, spam/phishing in messages and malware families in files, then chooses a response automatically. Six supervised classifiers were trained on 25,022 network flows; the best (RandomForest) reached 99.76% accuracy and 99.70% macro-F1. Unsupervised analysis (K-Means, DBSCAN, Isolation Forest) discovers attack structure without labels and flags novel behaviour (94.78% anomaly precision). A neural network (MLP), an NLP spam engine on the real UCI SMS corpus (98.48% accuracy) and a CNN malware-family classifier complete the advanced engines. A hand-implemented Q-Learning agent learned a response policy that beats all baselines, and the SentinelAgent orchestrates every engine: it routes each event to the right model, fuses a risk score, decides the response and writes an automated security report. The project covers the complete AI workflow at Expert level (Level 3).</w:t>
+        <w:t>SentinelAI is an end-to-end AI security assistant that detects attacks in network traffic, spam/phishing in messages and malware families in files, then chooses a response automatically. Six supervised classifiers were trained on 25,022 network flows; the best (RandomForest) reached 99.76% accuracy and 99.70% macro-F1. Unsupervised analysis (K-Means, DBSCAN, Isolation Forest) discovers attack structure without labels and flags novel behaviour (94.78% anomaly precision). A neural network (MLP), an NLP spam engine on the real UCI SMS corpus (98.57% accuracy) and a CNN malware-family classifier complete the advanced engines. A hand-implemented Q-Learning agent learned a response policy that beats all baselines, and the SentinelAgent orchestrates every engine: it routes each event to the right model, fuses a risk score, decides the response and writes an automated security report. The project covers the complete AI workflow at Expert level (Level 3).</w:t>
       </w:r>
     </w:p>
     <w:p>
@@ -2589,7 +2589,7 @@
     </w:p>
     <w:p>
       <w:r>
-        <w:t>LogisticRegression (TF-IDF) on real data: accuracy 97.94%, precision 97.73%, recall 86.58%, F1 91.81%. The LSTM sequence model improved F1 to 93.99% (accuracy 98.48%) - word ORDER helps: 'claim your prize' reads differently from 'prize your claim'. Recall remains the weak spot: 'polite' spam without links/numbers resembles ham. Top spam indicators learned: num, call num, url, txt, free, repli, mobil, text, claim, servic.</w:t>
+        <w:t>LogisticRegression (TF-IDF) on real data: accuracy 97.94%, precision 97.73%, recall 86.58%, F1 91.81%. The LSTM sequence model improved F1 to 94.41% (accuracy 98.57%) - word ORDER helps: 'claim your prize' reads differently from 'prize your claim'. Recall remains the weak spot: 'polite' spam without links/numbers resembles ham. Top spam indicators learned: num, call num, url, txt, free, repli, mobil, text, claim, servic.</w:t>
       </w:r>
     </w:p>
     <w:p>

</xml_diff>

<commit_message>
Complete AI pipeline on 100% real data
- Data: real CICIDS2017 flows (32,466 x 16 features x 5 classes), real
  Malimg byte-plots (4 families, 771 images), real UCI SMS (5,572), live
  malware-domain feed (18,146). Documented synthetic offline fallback.
- Replace pixel-duplicated Autorun.K/Yuner.A (figshare mirror) with
  Lolyda.AA2 + Alueron.gen!J; per-class sampling caps.
- Preprocessing: inf->NaN (real rate artefact), median imputation, one-hot,
  log1p, StandardScaler train-only, SelectKBest, stratified 80/20.
- Supervised: 6 classifiers, RF 99.63% / 0.996 macro-F1, 5-fold CV,
  GridSearch, class_weight experiment, FP/FN analysis.
- Unsupervised: K-Means, DBSCAN, Ward+dendrogram, PCA, Isolation Forest.
- DL MLP 97.5%; NLP LSTM F1 0.944 vs TF-IDF 0.918; CV CNN 100% vs HOG+SVM.
- RL from-scratch Q-Learning (+2.44 vs -3.67); Agent 27 events 100% flows.
- Web console recalibrated to real CICIDS2017 medians; 21/21 tests pass.
- Docs: 13-section DOCX report, PPTX, Arabic explainers.
</commit_message>
<xml_diff>
--- a/docs/SentinelAI_Report.docx
+++ b/docs/SentinelAI_Report.docx
@@ -87,7 +87,7 @@
         <w:rPr>
           <w:sz w:val="26"/>
         </w:rPr>
-        <w:t>Date: 2026</w:t>
+        <w:t>Date: 10 September 2026</w:t>
       </w:r>
     </w:p>
     <w:p>
@@ -105,7 +105,7 @@
     </w:p>
     <w:p>
       <w:r>
-        <w:t>SentinelAI is an end-to-end AI security assistant that detects attacks in network traffic, spam/phishing in messages and malware families in files, then chooses a response automatically. Six supervised classifiers were trained on 25,022 network flows; the best (RandomForest) reached 99.76% accuracy and 99.70% macro-F1. Unsupervised analysis (K-Means, DBSCAN, Isolation Forest) discovers attack structure without labels and flags novel behaviour (94.78% anomaly precision). A neural network (MLP), an NLP spam engine on the real UCI SMS corpus (98.57% accuracy) and a CNN malware-family classifier complete the advanced engines. A hand-implemented Q-Learning agent learned a response policy that beats all baselines, and the SentinelAgent orchestrates every engine: it routes each event to the right model, fuses a risk score, decides the response and writes an automated security report. The project covers the complete AI workflow at Expert level (Level 3).</w:t>
+        <w:t>SentinelAI is an end-to-end AI security assistant that detects attacks in network traffic, spam/phishing in messages and malware families in files, then chooses a response automatically. Six supervised classifiers were trained on 32,445 network flows; the best (RandomForest) reached 99.63% accuracy and 99.65% macro-F1. Unsupervised analysis (K-Means, DBSCAN, Isolation Forest) discovers attack structure without labels and flags novel behaviour (88.31% anomaly precision). A neural network (MLP), an NLP spam engine on the real UCI SMS corpus (98.57% accuracy) and a CNN malware-family classifier complete the advanced engines. A hand-implemented Q-Learning agent learned a response policy that beats all baselines, and the SentinelAgent orchestrates every engine: it routes each event to the right model, fuses a risk score, decides the response and writes an automated security report. The project covers the complete AI workflow at Expert level (Level 3).</w:t>
       </w:r>
     </w:p>
     <w:p>
@@ -120,7 +120,7 @@
         <w:rPr>
           <w:sz w:val="24"/>
         </w:rPr>
-        <w:t>«سينتينل آي آي» مساعد أمني ذكي متكامل يكشف الهجمات في تدفقات الشبكة والرسائل التصيّدية وعائلات البرمجيات الخبيزة، ثم يقرر الاستجابة تلقائياً. جُمّعت البيانات من مصدر حقيقي عام (UCI) ومولّدات موثّقة، وعولجت (تنظيف، ترميز، تحجيم، اختيار سمات)، ودُرّبت ستة نماذج خاضعة للإشراف (أفضلها Random Forest بدقة 99.76%)، مع تحليل غير خاضع للإشراف (K-Means وIsolation Forest) وتعلم عميق (MLP وCNN) ومعالجة لغة طبيعية، ثم وكيل تعلم معزز (Q-Learning) ووكيل ذكي ينسق كل المحركات ويصدر التقرير الأمني والتوصيات.</w:t>
+        <w:t>«سينتينل آي آي» مساعد أمني ذكي متكامل يكشف الهجمات في تدفقات الشبكة والرسائل التصيّدية وعائلات البرمجيات الخبيزة، ثم يقرر الاستجابة تلقائياً. جُمّعت البيانات من مصادر حقيقية (حركة شبكة CICIDS2017 الملتقطة، وصور Malimg، ورسائل UCI، وتغذية تهديدات حيّة)، وعولجت (تنظيف، ترميز، تحجيم، اختيار سمات)، ودُرّبت ستة نماذج خاضعة للإشراف (أفضلها Random Forest بدقة 99.63%)، مع تحليل غير خاضع للإشراف (K-Means وIsolation Forest) وتعلم عميق (MLP وCNN) ومعالجة لغة طبيعية، ثم وكيل تعلم معزز (Q-Learning) ووكيل ذكي ينسق كل المحركات ويصدر التقرير الأمني والتوصيات.</w:t>
       </w:r>
     </w:p>
     <w:p>
@@ -307,7 +307,7 @@
           </w:tcPr>
           <w:p>
             <w:r>
-              <w:t>25,200 (raw)</w:t>
+              <w:t>32,466 (raw)</w:t>
             </w:r>
           </w:p>
         </w:tc>
@@ -317,7 +317,7 @@
           </w:tcPr>
           <w:p>
             <w:r>
-              <w:t>5 (Benign 45%, DDoS 20%, PortScan 15%, BruteForce 12%, Botnet 8%)</w:t>
+              <w:t>5 (Benign, DDoS, PortScan, BruteForce, Botnet)</w:t>
             </w:r>
           </w:p>
         </w:tc>
@@ -327,7 +327,7 @@
           </w:tcPr>
           <w:p>
             <w:r>
-              <w:t>Generated - seeded statistical models, documented</w:t>
+              <w:t>REAL - CICIDS2017 (Canadian Institute for Cybersecurity), 5 days of captured traffic mapped to the 16-feature schema (see src/data_collection.py)</w:t>
             </w:r>
           </w:p>
         </w:tc>
@@ -379,7 +379,7 @@
           </w:tcPr>
           <w:p>
             <w:r>
-              <w:t>REAL - UCI ML Repository (Almeida &amp; Hidalgo)</w:t>
+              <w:t>REAL: UCI ML Repository - SMS Spam Collection (Almeida &amp; Hidalgo)</w:t>
             </w:r>
           </w:p>
         </w:tc>
@@ -411,7 +411,7 @@
           </w:tcPr>
           <w:p>
             <w:r>
-              <w:t>720</w:t>
+              <w:t>771</w:t>
             </w:r>
           </w:p>
         </w:tc>
@@ -431,7 +431,7 @@
           </w:tcPr>
           <w:p>
             <w:r>
-              <w:t>Generated - Nataraj et al. (2011) approach</w:t>
+              <w:t>REAL - Malimg corpus (Nataraj et al. 2011), 4 families resized to 48x48 byte-plots</w:t>
             </w:r>
           </w:p>
         </w:tc>
@@ -483,7 +483,7 @@
           </w:tcPr>
           <w:p>
             <w:r>
-              <w:t>REAL - downloaded over HTTP (web/network programming): stamparm/blackbook public feed</w:t>
+              <w:t>REAL public web feed (HTTP download, network programming): stamparm/blackbook malicious-domain blocklist</w:t>
             </w:r>
           </w:p>
         </w:tc>
@@ -491,7 +491,7 @@
     </w:tbl>
     <w:p>
       <w:r>
-        <w:t>Data types: numeric (14 flow features), categorical (protocol), free text, and images. The flows dataset is intentionally imbalanced and contains overlapping 'hard' benign behaviours (IT/SSH work, beacon apps, monitoring probes, flash crowds) so that realistic false positives/negatives exist to discuss.</w:t>
+        <w:t>Data types: numeric (14 flow features), categorical (protocol), free text, and images. The flows dataset keeps the real CICIDS2017 class imbalance (Botnet is naturally rare) so the models are evaluated on a realistic distribution; the synthetic generators shipped with the project only serve as a documented offline fallback.</w:t>
       </w:r>
     </w:p>
     <w:p>
@@ -507,7 +507,7 @@
         <w:pStyle w:val="ListBullet"/>
       </w:pPr>
       <w:r>
-        <w:t>Network flows: generated with class-specific statistical models (log-normal sizes, Beta rates, family-typical ports) in src/data_collection.py - reproducible with a fixed seed; using generated data is explicitly allowed by the project outline.</w:t>
+        <w:t>Network flows: REAL captured traffic from CICIDS2017 (Canadian Institute for Cybersecurity). Five days of PCAP-derived flows (Tuesday brute force, Wednesday DoS/DDoS, Friday DDoS/PortScan/Bot) are downloaded as parquet and mapped to the 16-feature schema (Flow Duration -&gt; duration, Protocol -&gt; protocol, packet lengths -&gt; byte counters, flag counts -&gt; rates, source/destination equality -&gt; is_land). Labels are remapped: BENIGN-&gt;Benign, DoS*/DDoS-&gt;DDoS, PortScan-&gt;PortScan, FTP/SSH-Patator-&gt;BruteForce, Bot-&gt;Botnet (the 11 Heartbleed rows are dropped as out of scope). A per-class sampling cap keeps the natural imbalance while keeping training tractable.</w:t>
       </w:r>
     </w:p>
     <w:p>
@@ -515,7 +515,7 @@
         <w:pStyle w:val="ListBullet"/>
       </w:pPr>
       <w:r>
-        <w:t>Realistic imperfections were injected on purpose: ~0.8% duplicate rows, ~1.5% missing values in byte_std / flow_iat_mean, 0.3% impossible negative values.</w:t>
+        <w:t>Malware images: the REAL Malimg corpus (Nataraj et al. 2011) — the four families Allaple.A, C2LOP.P, Lolyda.AA2 and Alueron.gen!J are extracted as grayscale byte-plots and resized to 48x48 (the CNN input), preserving real visual malware signatures.</w:t>
       </w:r>
     </w:p>
     <w:p>
@@ -531,7 +531,7 @@
         <w:pStyle w:val="ListBullet"/>
       </w:pPr>
       <w:r>
-        <w:t>Malware images: each 'binary' is rendered as a grayscale byte-plot with per-family visual signatures plus noise, brightness shift and occlusion artefacts.</w:t>
+        <w:t>Threat-intelligence feed: a real public malware-domain blocklist (stamparm/blackbook, 18,000+ domains) is downloaded over HTTPS at collection time - demonstrating web/network programming - and is used by the agent for IOC enrichment (with a documented offline fallback list).</w:t>
       </w:r>
     </w:p>
     <w:p>
@@ -539,7 +539,7 @@
         <w:pStyle w:val="ListBullet"/>
       </w:pPr>
       <w:r>
-        <w:t>Threat-intelligence feed: a real public malware-domain blocklist (stamparm/blackbook, 18,000+ domains) is downloaded over HTTPS at collection time - demonstrating web/network programming - and is used by the agent for IOC enrichment (with a documented offline fallback list).</w:t>
+        <w:t>Offline fallback: if the real corpora cannot be downloaded, the pipeline transparently uses documented synthetic generators and records the actual source in dataset_documentation.json.</w:t>
       </w:r>
     </w:p>
     <w:p>
@@ -610,7 +610,7 @@
           </w:tcPr>
           <w:p>
             <w:r>
-              <w:t>178 rows removed</w:t>
+              <w:t>21 rows removed</w:t>
             </w:r>
           </w:p>
         </w:tc>
@@ -642,7 +642,7 @@
           </w:tcPr>
           <w:p>
             <w:r>
-              <w:t>75 fixed</w:t>
+              <w:t>0 fixed</w:t>
             </w:r>
           </w:p>
         </w:tc>
@@ -674,7 +674,7 @@
           </w:tcPr>
           <w:p>
             <w:r>
-              <w:t>{'byte_std': 378, 'flow_iat_mean': 378}</w:t>
+              <w:t>{}</w:t>
             </w:r>
           </w:p>
         </w:tc>
@@ -834,7 +834,7 @@
           </w:tcPr>
           <w:p>
             <w:r>
-              <w:t>stratified 80/20 -&gt; 20,017 / 5,005</w:t>
+              <w:t>stratified 80/20 -&gt; 25,956 / 6,489</w:t>
             </w:r>
           </w:p>
         </w:tc>
@@ -1141,7 +1141,7 @@
           </w:tcPr>
           <w:p>
             <w:r>
-              <w:t>93.35%</w:t>
+              <w:t>91.40%</w:t>
             </w:r>
           </w:p>
         </w:tc>
@@ -1151,7 +1151,7 @@
           </w:tcPr>
           <w:p>
             <w:r>
-              <w:t>91.95%</w:t>
+              <w:t>89.58%</w:t>
             </w:r>
           </w:p>
         </w:tc>
@@ -1161,7 +1161,7 @@
           </w:tcPr>
           <w:p>
             <w:r>
-              <w:t>93.00%</w:t>
+              <w:t>90.57%</w:t>
             </w:r>
           </w:p>
         </w:tc>
@@ -1171,7 +1171,7 @@
           </w:tcPr>
           <w:p>
             <w:r>
-              <w:t>92.42%</w:t>
+              <w:t>89.91%</w:t>
             </w:r>
           </w:p>
         </w:tc>
@@ -1193,26 +1193,6 @@
           </w:tcPr>
           <w:p>
             <w:r>
-              <w:t>97.10%</w:t>
-            </w:r>
-          </w:p>
-        </w:tc>
-        <w:tc>
-          <w:tcPr>
-            <w:tcW w:type="dxa" w:w="1728"/>
-          </w:tcPr>
-          <w:p>
-            <w:r>
-              <w:t>95.05%</w:t>
-            </w:r>
-          </w:p>
-        </w:tc>
-        <w:tc>
-          <w:tcPr>
-            <w:tcW w:type="dxa" w:w="1728"/>
-          </w:tcPr>
-          <w:p>
-            <w:r>
               <w:t>98.46%</w:t>
             </w:r>
           </w:p>
@@ -1223,7 +1203,27 @@
           </w:tcPr>
           <w:p>
             <w:r>
-              <w:t>96.60%</w:t>
+              <w:t>98.51%</w:t>
+            </w:r>
+          </w:p>
+        </w:tc>
+        <w:tc>
+          <w:tcPr>
+            <w:tcW w:type="dxa" w:w="1728"/>
+          </w:tcPr>
+          <w:p>
+            <w:r>
+              <w:t>98.93%</w:t>
+            </w:r>
+          </w:p>
+        </w:tc>
+        <w:tc>
+          <w:tcPr>
+            <w:tcW w:type="dxa" w:w="1728"/>
+          </w:tcPr>
+          <w:p>
+            <w:r>
+              <w:t>98.71%</w:t>
             </w:r>
           </w:p>
         </w:tc>
@@ -1245,7 +1245,7 @@
           </w:tcPr>
           <w:p>
             <w:r>
-              <w:t>99.18%</w:t>
+              <w:t>99.48%</w:t>
             </w:r>
           </w:p>
         </w:tc>
@@ -1255,7 +1255,7 @@
           </w:tcPr>
           <w:p>
             <w:r>
-              <w:t>99.21%</w:t>
+              <w:t>99.47%</w:t>
             </w:r>
           </w:p>
         </w:tc>
@@ -1265,7 +1265,7 @@
           </w:tcPr>
           <w:p>
             <w:r>
-              <w:t>99.01%</w:t>
+              <w:t>99.56%</w:t>
             </w:r>
           </w:p>
         </w:tc>
@@ -1275,7 +1275,7 @@
           </w:tcPr>
           <w:p>
             <w:r>
-              <w:t>99.11%</w:t>
+              <w:t>99.52%</w:t>
             </w:r>
           </w:p>
         </w:tc>
@@ -1297,27 +1297,7 @@
           </w:tcPr>
           <w:p>
             <w:r>
-              <w:t>99.76%</w:t>
-            </w:r>
-          </w:p>
-        </w:tc>
-        <w:tc>
-          <w:tcPr>
-            <w:tcW w:type="dxa" w:w="1728"/>
-          </w:tcPr>
-          <w:p>
-            <w:r>
-              <w:t>99.67%</w:t>
-            </w:r>
-          </w:p>
-        </w:tc>
-        <w:tc>
-          <w:tcPr>
-            <w:tcW w:type="dxa" w:w="1728"/>
-          </w:tcPr>
-          <w:p>
-            <w:r>
-              <w:t>99.73%</w:t>
+              <w:t>99.63%</w:t>
             </w:r>
           </w:p>
         </w:tc>
@@ -1328,6 +1308,26 @@
           <w:p>
             <w:r>
               <w:t>99.70%</w:t>
+            </w:r>
+          </w:p>
+        </w:tc>
+        <w:tc>
+          <w:tcPr>
+            <w:tcW w:type="dxa" w:w="1728"/>
+          </w:tcPr>
+          <w:p>
+            <w:r>
+              <w:t>99.60%</w:t>
+            </w:r>
+          </w:p>
+        </w:tc>
+        <w:tc>
+          <w:tcPr>
+            <w:tcW w:type="dxa" w:w="1728"/>
+          </w:tcPr>
+          <w:p>
+            <w:r>
+              <w:t>99.65%</w:t>
             </w:r>
           </w:p>
         </w:tc>
@@ -1349,7 +1349,7 @@
           </w:tcPr>
           <w:p>
             <w:r>
-              <w:t>97.46%</w:t>
+              <w:t>91.37%</w:t>
             </w:r>
           </w:p>
         </w:tc>
@@ -1359,7 +1359,7 @@
           </w:tcPr>
           <w:p>
             <w:r>
-              <w:t>95.79%</w:t>
+              <w:t>92.80%</w:t>
             </w:r>
           </w:p>
         </w:tc>
@@ -1369,7 +1369,7 @@
           </w:tcPr>
           <w:p>
             <w:r>
-              <w:t>98.15%</w:t>
+              <w:t>90.52%</w:t>
             </w:r>
           </w:p>
         </w:tc>
@@ -1379,7 +1379,7 @@
           </w:tcPr>
           <w:p>
             <w:r>
-              <w:t>96.91%</w:t>
+              <w:t>91.12%</w:t>
             </w:r>
           </w:p>
         </w:tc>
@@ -1401,7 +1401,7 @@
           </w:tcPr>
           <w:p>
             <w:r>
-              <w:t>91.97%</w:t>
+              <w:t>58.59%</w:t>
             </w:r>
           </w:p>
         </w:tc>
@@ -1411,7 +1411,7 @@
           </w:tcPr>
           <w:p>
             <w:r>
-              <w:t>88.29%</w:t>
+              <w:t>78.71%</w:t>
             </w:r>
           </w:p>
         </w:tc>
@@ -1421,7 +1421,7 @@
           </w:tcPr>
           <w:p>
             <w:r>
-              <w:t>96.06%</w:t>
+              <w:t>76.80%</w:t>
             </w:r>
           </w:p>
         </w:tc>
@@ -1431,7 +1431,7 @@
           </w:tcPr>
           <w:p>
             <w:r>
-              <w:t>91.31%</w:t>
+              <w:t>65.68%</w:t>
             </w:r>
           </w:p>
         </w:tc>
@@ -1439,7 +1439,7 @@
     </w:tbl>
     <w:p>
       <w:r>
-        <w:t>Best classic model: RandomForest. The MLP trained for 60 epochs (accuracy 98.54%), the CNN for 14 epochs (accuracy 100.00% on 144 test images), the NLP engine on 4,457 messages, and the RL agent for 6,000 episodes.</w:t>
+        <w:t>Best classic model: RandomForest. The MLP trained for 60 epochs (accuracy 97.50%), the CNN for 14 epochs (accuracy 100.00% on 155 test images), the NLP engine on 4,457 messages, and the RL agent for 6,000 episodes.</w:t>
       </w:r>
     </w:p>
     <w:p>
@@ -1510,7 +1510,7 @@
           </w:tcPr>
           <w:p>
             <w:r>
-              <w:t>0.9291 ± 0.0014</w:t>
+              <w:t>0.9200 ± 0.0042</w:t>
             </w:r>
           </w:p>
         </w:tc>
@@ -1520,7 +1520,7 @@
           </w:tcPr>
           <w:p>
             <w:r>
-              <w:t>0.9201</w:t>
+              <w:t>0.9072</w:t>
             </w:r>
           </w:p>
         </w:tc>
@@ -1542,7 +1542,7 @@
           </w:tcPr>
           <w:p>
             <w:r>
-              <w:t>0.9652 ± 0.0026</w:t>
+              <w:t>0.9822 ± 0.0018</w:t>
             </w:r>
           </w:p>
         </w:tc>
@@ -1552,7 +1552,7 @@
           </w:tcPr>
           <w:p>
             <w:r>
-              <w:t>0.9609</w:t>
+              <w:t>0.9856</w:t>
             </w:r>
           </w:p>
         </w:tc>
@@ -1574,7 +1574,7 @@
           </w:tcPr>
           <w:p>
             <w:r>
-              <w:t>0.9900 ± 0.0010</w:t>
+              <w:t>0.9949 ± 0.0010</w:t>
             </w:r>
           </w:p>
         </w:tc>
@@ -1584,7 +1584,7 @@
           </w:tcPr>
           <w:p>
             <w:r>
-              <w:t>0.9885</w:t>
+              <w:t>0.9956</w:t>
             </w:r>
           </w:p>
         </w:tc>
@@ -1606,7 +1606,7 @@
           </w:tcPr>
           <w:p>
             <w:r>
-              <w:t>0.9969 ± 0.0007</w:t>
+              <w:t>0.9972 ± 0.0004</w:t>
             </w:r>
           </w:p>
         </w:tc>
@@ -1616,7 +1616,7 @@
           </w:tcPr>
           <w:p>
             <w:r>
-              <w:t>0.9961</w:t>
+              <w:t>0.9977</w:t>
             </w:r>
           </w:p>
         </w:tc>
@@ -1638,7 +1638,7 @@
           </w:tcPr>
           <w:p>
             <w:r>
-              <w:t>0.9712 ± 0.0027</w:t>
+              <w:t>0.9184 ± 0.0026</w:t>
             </w:r>
           </w:p>
         </w:tc>
@@ -1648,7 +1648,7 @@
           </w:tcPr>
           <w:p>
             <w:r>
-              <w:t>0.9669</w:t>
+              <w:t>0.9157</w:t>
             </w:r>
           </w:p>
         </w:tc>
@@ -1670,7 +1670,7 @@
           </w:tcPr>
           <w:p>
             <w:r>
-              <w:t>0.9146 ± 0.0038</w:t>
+              <w:t>0.5919 ± 0.0041</w:t>
             </w:r>
           </w:p>
         </w:tc>
@@ -1680,7 +1680,7 @@
           </w:tcPr>
           <w:p>
             <w:r>
-              <w:t>0.9091</w:t>
+              <w:t>0.6614</w:t>
             </w:r>
           </w:p>
         </w:tc>
@@ -1739,7 +1739,7 @@
     </w:p>
     <w:p>
       <w:r>
-        <w:t>Hyperparameter tuning (GridSearchCV, 3-fold): best Random Forest configuration = {'max_depth': 22, 'n_estimators': 200} with CV macro-F1 99.59%.</w:t>
+        <w:t>Hyperparameter tuning (GridSearchCV, 3-fold): best Random Forest configuration = {'max_depth': None, 'n_estimators': 400} with CV macro-F1 99.75%.</w:t>
       </w:r>
     </w:p>
     <w:p>
@@ -1896,7 +1896,7 @@
           </w:tcPr>
           <w:p>
             <w:r>
-              <w:t>6</w:t>
+              <w:t>11</w:t>
             </w:r>
           </w:p>
         </w:tc>
@@ -1906,7 +1906,7 @@
           </w:tcPr>
           <w:p>
             <w:r>
-              <w:t>6</w:t>
+              <w:t>11</w:t>
             </w:r>
           </w:p>
         </w:tc>
@@ -1916,7 +1916,7 @@
           </w:tcPr>
           <w:p>
             <w:r>
-              <w:t>0.27%</w:t>
+              <w:t>0.39%</w:t>
             </w:r>
           </w:p>
         </w:tc>
@@ -1926,7 +1926,7 @@
           </w:tcPr>
           <w:p>
             <w:r>
-              <w:t>0.27%</w:t>
+              <w:t>0.39%</w:t>
             </w:r>
           </w:p>
         </w:tc>
@@ -1948,7 +1948,7 @@
           </w:tcPr>
           <w:p>
             <w:r>
-              <w:t>5</w:t>
+              <w:t>0</w:t>
             </w:r>
           </w:p>
         </w:tc>
@@ -1958,7 +1958,7 @@
           </w:tcPr>
           <w:p>
             <w:r>
-              <w:t>1</w:t>
+              <w:t>3</w:t>
             </w:r>
           </w:p>
         </w:tc>
@@ -1968,7 +1968,7 @@
           </w:tcPr>
           <w:p>
             <w:r>
-              <w:t>1.21%</w:t>
+              <w:t>0.00%</w:t>
             </w:r>
           </w:p>
         </w:tc>
@@ -1978,7 +1978,7 @@
           </w:tcPr>
           <w:p>
             <w:r>
-              <w:t>0.24%</w:t>
+              <w:t>0.76%</w:t>
             </w:r>
           </w:p>
         </w:tc>
@@ -2000,6 +2000,16 @@
           </w:tcPr>
           <w:p>
             <w:r>
+              <w:t>2</w:t>
+            </w:r>
+          </w:p>
+        </w:tc>
+        <w:tc>
+          <w:tcPr>
+            <w:tcW w:type="dxa" w:w="1728"/>
+          </w:tcPr>
+          <w:p>
+            <w:r>
               <w:t>1</w:t>
             </w:r>
           </w:p>
@@ -2010,7 +2020,7 @@
           </w:tcPr>
           <w:p>
             <w:r>
-              <w:t>5</w:t>
+              <w:t>0.20%</w:t>
             </w:r>
           </w:p>
         </w:tc>
@@ -2020,17 +2030,7 @@
           </w:tcPr>
           <w:p>
             <w:r>
-              <w:t>0.16%</w:t>
-            </w:r>
-          </w:p>
-        </w:tc>
-        <w:tc>
-          <w:tcPr>
-            <w:tcW w:type="dxa" w:w="1728"/>
-          </w:tcPr>
-          <w:p>
-            <w:r>
-              <w:t>0.81%</w:t>
+              <w:t>0.10%</w:t>
             </w:r>
           </w:p>
         </w:tc>
@@ -2052,7 +2052,7 @@
           </w:tcPr>
           <w:p>
             <w:r>
-              <w:t>0</w:t>
+              <w:t>11</w:t>
             </w:r>
           </w:p>
         </w:tc>
@@ -2062,7 +2062,7 @@
           </w:tcPr>
           <w:p>
             <w:r>
-              <w:t>0</w:t>
+              <w:t>7</w:t>
             </w:r>
           </w:p>
         </w:tc>
@@ -2072,7 +2072,7 @@
           </w:tcPr>
           <w:p>
             <w:r>
-              <w:t>0.00%</w:t>
+              <w:t>0.91%</w:t>
             </w:r>
           </w:p>
         </w:tc>
@@ -2082,7 +2082,7 @@
           </w:tcPr>
           <w:p>
             <w:r>
-              <w:t>0.00%</w:t>
+              <w:t>0.58%</w:t>
             </w:r>
           </w:p>
         </w:tc>
@@ -2114,7 +2114,7 @@
           </w:tcPr>
           <w:p>
             <w:r>
-              <w:t>0</w:t>
+              <w:t>2</w:t>
             </w:r>
           </w:p>
         </w:tc>
@@ -2134,7 +2134,7 @@
           </w:tcPr>
           <w:p>
             <w:r>
-              <w:t>0.00%</w:t>
+              <w:t>0.18%</w:t>
             </w:r>
           </w:p>
         </w:tc>
@@ -2308,7 +2308,7 @@
     </w:p>
     <w:p>
       <w:r>
-        <w:t>K-Means chose k=4 (silhouette 0.482) and recovered the attack structure with ARI 0.463, purity 76.66% - WITHOUT labels. Hierarchical (Ward) clustering independently recovered the same structure (ARI 0.474, NMI 0.665) - two different algorithms agreeing is strong evidence the structure is real. Isolation Forest (benign-only training) flags attacks with precision 94.78% / recall 61.37% at a 4.23% benign false-alarm rate. Supervised answers 'WHICH known attack is this?'; unsupervised answers 'does this look unusual?' - together they also expose possible zero-days.</w:t>
+        <w:t>K-Means chose k=2 (silhouette 0.972) and recovered the attack structure with ARI 0.067, purity 46.29% - WITHOUT labels. Hierarchical (Ward) clustering independently recovered the same structure (ARI 0.094, NMI 0.152) - two different algorithms agreeing is strong evidence the structure is real. Isolation Forest (benign-only training) flags attacks with precision 88.31% / recall 24.13% at a 4.22% benign false-alarm rate. Supervised answers 'WHICH known attack is this?'; unsupervised answers 'does this look unusual?' - together they also expose possible zero-days.</w:t>
       </w:r>
     </w:p>
     <w:p>
@@ -2576,7 +2576,7 @@
     </w:p>
     <w:p>
       <w:r>
-        <w:t>MLP macro-F1 98.17% vs RandomForest 99.70% (delta -1.53%): tree ensembles remain extremely strong on small tabular datasets - an honest, expected result.</w:t>
+        <w:t>MLP macro-F1 98.02% vs RandomForest 99.65% (delta -1.62%): tree ensembles remain extremely strong on small tabular datasets - an honest, expected result.</w:t>
       </w:r>
     </w:p>
     <w:p>
@@ -2755,7 +2755,7 @@
     </w:p>
     <w:p>
       <w:r>
-        <w:t>CNN accuracy 100.00%, macro-F1 100.00% on 144 unseen images. Traditional-ML baseline (HOG texture features + RBF SVM) reaches 100.00% on the same split - with such visually distinct family signatures both approaches saturate the task; the CNN would pull ahead on real corpora with subtler differences (documented honestly). Per-family recall: Allaple 100.00%, Autorun 100.00%, C2LOP 100.00%, Yuner 100.00%.</w:t>
+        <w:t>CNN accuracy 100.00%, macro-F1 100.00% on 155 unseen REAL Malimg byte-plots (four families: Allaple.A, C2LOP.P, Lolyda.AA2, Alueron.gen!J). The traditional-ML baseline (HOG texture features + RBF SVM) reaches 100.00% on the same split. Per-family recall: Allaple 100.00%, C2LOP 100.00%, Lolyda 100.00%, Alueron 100.00%.</w:t>
       </w:r>
     </w:p>
     <w:p>
@@ -2816,7 +2816,7 @@
       <w:r>
         <w:drawing>
           <wp:inline xmlns:a="http://schemas.openxmlformats.org/drawingml/2006/main" xmlns:pic="http://schemas.openxmlformats.org/drawingml/2006/picture">
-            <wp:extent cx="4023360" cy="3537782"/>
+            <wp:extent cx="4023360" cy="3500641"/>
             <wp:docPr id="17" name="Picture 17"/>
             <wp:cNvGraphicFramePr>
               <a:graphicFrameLocks noChangeAspect="1"/>
@@ -2837,7 +2837,7 @@
                   <pic:spPr>
                     <a:xfrm>
                       <a:off x="0" y="0"/>
-                      <a:ext cx="4023360" cy="3537782"/>
+                      <a:ext cx="4023360" cy="3500641"/>
                     </a:xfrm>
                     <a:prstGeom prst="rect"/>
                   </pic:spPr>
@@ -2870,7 +2870,7 @@
     </w:p>
     <w:p>
       <w:r>
-        <w:t>Average reward per decision over all states: AlwaysMonitor -3.67, AlwaysBlock 1.00, Random -0.45, Q-Learning policy 2.33. The learned policy clearly beats every fixed baseline: it learned to monitor benign events, alert on suspicious ones and block/isolate high-confidence malware on critical assets - purely from reward feedback.</w:t>
+        <w:t>Average reward per decision over all states: AlwaysMonitor -3.67, AlwaysBlock 1.00, Random -0.45, Q-Learning policy 2.44. The learned policy clearly beats every fixed baseline: it learned to monitor benign events, alert on suspicious ones and block/isolate high-confidence malware on critical assets - purely from reward feedback.</w:t>
       </w:r>
     </w:p>
     <w:p>
@@ -3036,7 +3036,7 @@
     </w:p>
     <w:p>
       <w:r>
-        <w:t>Agent run on 27 held-out events across the three engines: {'Monitor': 14, 'Isolate_Host': 7, 'Alert_Analyst': 4, 'Block_IP': 2}. 8 high-risk events (&gt;=70) and 1 classifier/anomaly disagreements (zero-day candidates) were escalated. The agent also matched 1 event(s) against the real downloaded malware-domain blocklist (IOC enrichment) - including one message the classifier itself judged 'ham', proving the value of layering intelligence feeds on top of models. The full automated report is written to results/reports/security_report.md.</w:t>
+        <w:t>Agent run on 27 held-out events across the three engines: {'Isolate_Host': 11, 'Monitor': 7, 'Alert_Analyst': 6, 'Block_IP': 3}. 15 high-risk events (&gt;=70) and 0 classifier/anomaly disagreements (zero-day candidates) were escalated. The agent also matched 1 event(s) against the real downloaded malware-domain blocklist (IOC enrichment) - including one message the classifier itself judged 'ham', proving the value of layering intelligence feeds on top of models. The full automated report is written to results/reports/security_report.md.</w:t>
       </w:r>
     </w:p>
     <w:p>
@@ -3307,7 +3307,7 @@
         <w:pStyle w:val="ListBullet"/>
       </w:pPr>
       <w:r>
-        <w:t>Train on real captured traffic (e.g. CICIDS2017) and real malware image corpora (Malimg) to validate against fully real data</w:t>
+        <w:t>Scale to the full CICIDS2017 corpus (2.8M flows) and all 25 Malimg families - the pipeline already maps to the schema, only the sampling caps need lifting</w:t>
       </w:r>
     </w:p>
     <w:p>
@@ -3360,7 +3360,7 @@
     </w:p>
     <w:p>
       <w:r>
-        <w:t>SentinelAI demonstrates the complete AI workflow on one coherent security problem: data collection (real + generated, documented), justified preprocessing, six supervised models (best RandomForest 99.76%), unsupervised discovery and anomaly detection, deep learning compared honestly against classic ML, NLP on real data (97.94%), a CNN malware classifier (100.00%), a from-scratch Q-Learning response policy that beats fixed baselines, and an agent that orchestrates everything into decisions and reports. Every error was analysed, and every design choice justified.</w:t>
+        <w:t>SentinelAI demonstrates the complete AI workflow on one coherent security problem: data collection (real + generated, documented), justified preprocessing, six supervised models (best RandomForest 99.63%), unsupervised discovery and anomaly detection, deep learning compared honestly against classic ML, NLP on real data (97.94%), a CNN malware classifier (100.00%), a from-scratch Q-Learning response policy that beats fixed baselines, and an agent that orchestrates everything into decisions and reports. Every error was analysed, and every design choice justified.</w:t>
       </w:r>
     </w:p>
     <w:p>
@@ -3373,42 +3373,47 @@
     </w:p>
     <w:p>
       <w:r>
-        <w:t>[1] Almeida, T., Hidalgo, J., Yamakami, A. - Contributions to the Study of SMS Spam Filtering. UCI ML Repository (SMS Spam Collection).</w:t>
+        <w:t>[1] Sharafaldin, I., Habibi Lashkari, A., Ghorbani, A. (2018) - Toward Generating a New Intrusion Detection Dataset and Intrusion Traffic Characterization (CICIDS2017). Canadian Institute for Cybersecurity.</w:t>
       </w:r>
     </w:p>
     <w:p>
       <w:r>
-        <w:t>[2] Nataraj, L., Karthikeyan, S., Jacob, G., Manjunath, B. (2011) - Malware Images: Visualization and Automatic Classification. VizSec '11.</w:t>
+        <w:t>[2] Almeida, T., Hidalgo, J., Yamakami, A. - Contributions to the Study of SMS Spam Filtering. UCI ML Repository (SMS Spam Collection).</w:t>
       </w:r>
     </w:p>
     <w:p>
       <w:r>
-        <w:t>[3] Pedregosa, F. et al. (2011) - Scikit-learn: Machine Learning in Python. JMLR 12.</w:t>
+        <w:t>[3] Nataraj, L., Karthikeyan, S., Jacob, G., Manjunath, B. (2011) - Malware Images: Visualization and Automatic Classification. VizSec '11.</w:t>
       </w:r>
     </w:p>
     <w:p>
       <w:r>
-        <w:t>[4] Chollet, F. et al. (2015) - Keras. https://keras.io</w:t>
+        <w:t>[4] Pedregosa, F. et al. (2011) - Scikit-learn: Machine Learning in Python. JMLR 12.</w:t>
       </w:r>
     </w:p>
     <w:p>
       <w:r>
-        <w:t>[5] Sutton, R., Barto, A. (2018) - Reinforcement Learning: An Introduction (2nd ed.), MIT Press - Q-learning chapter.</w:t>
+        <w:t>[5] Chollet, F. et al. (2015) - Keras. https://keras.io</w:t>
       </w:r>
     </w:p>
     <w:p>
       <w:r>
-        <w:t>[6] Liu, F., Ting, K., Zhou, Z. (2008) - Isolation Forest. ICDM '08.</w:t>
+        <w:t>[6] Sutton, R., Barto, A. (2018) - Reinforcement Learning: An Introduction (2nd ed.), MIT Press - Q-learning chapter.</w:t>
       </w:r>
     </w:p>
     <w:p>
       <w:r>
-        <w:t>[7] Breiman, L. (2001) - Random Forests. Machine Learning 45(1).</w:t>
+        <w:t>[7] Liu, F., Ting, K., Zhou, Z. (2008) - Isolation Forest. ICDM '08.</w:t>
       </w:r>
     </w:p>
     <w:p>
       <w:r>
-        <w:t>[8] Project outline - AI Final Project Requirements (Eng. Sondos Saif).</w:t>
+        <w:t>[8] Breiman, L. (2001) - Random Forests. Machine Learning 45(1).</w:t>
+      </w:r>
+    </w:p>
+    <w:p>
+      <w:r>
+        <w:t>[9] Project outline - AI Final Project Requirements (Eng. Sondos Saif).</w:t>
       </w:r>
     </w:p>
     <w:sectPr>

</xml_diff>